<commit_message>
new group-based vetting, admin IP allowlist, and email authentication features; updated documentation
</commit_message>
<xml_diff>
--- a/ConduVet_User_Tutorial.docx
+++ b/ConduVet_User_Tutorial.docx
@@ -31,6 +31,14 @@
         </w:rPr>
         <w:t>User Tutorial</w:t>
       </w:r>
+      <w:r>
+        <w:rPr>
+          <w:color w:val="2E75B6"/>
+          <w:sz w:val="40"/>
+          <w:szCs w:val="40"/>
+        </w:rPr>
+        <w:t xml:space="preserve"> (V0.2)</w:t>
+      </w:r>
     </w:p>
     <w:p>
       <w:pPr>
@@ -75,7 +83,19 @@
         <w:jc w:val="both"/>
       </w:pPr>
       <w:r>
-        <w:t>ConduVet is a web application for vetting crowd-sourced tabular data. An administrator uploads Excel workbooks that carry both the data and its schema; users log in, fill in or correct the records assigned to them, and submit. Every change is audited, backups run automatically, and the data can be downloaded at any time as a clean Excel file.</w:t>
+        <w:t>ConduVet is a web application for vetting crowd-sourced tabular data. An administrator uploads Excel workbooks that c</w:t>
+      </w:r>
+      <w:r>
+        <w:t>ontain</w:t>
+      </w:r>
+      <w:r>
+        <w:t xml:space="preserve"> both the data and its schema; users log in, fill in or correct the records assigned to them, and submit</w:t>
+      </w:r>
+      <w:r>
+        <w:t xml:space="preserve"> them</w:t>
+      </w:r>
+      <w:r>
+        <w:t>. Every change is audited, backups run automatically, and the data can be downloaded at any time as a clean Excel file.</w:t>
       </w:r>
     </w:p>
     <w:p>
@@ -84,7 +104,13 @@
         <w:jc w:val="both"/>
       </w:pPr>
       <w:r>
-        <w:t>The instance title you see in the header is set by the administrator — in the examples in this guide it appears as “CTI Data Vetting [Test].” This tutorial is split into three parts so you can read only what applies to you:</w:t>
+        <w:t>The instance title you see in the header is set by the administrator — in the examples in this guide</w:t>
+      </w:r>
+      <w:r>
+        <w:t>,</w:t>
+      </w:r>
+      <w:r>
+        <w:t xml:space="preserve"> it appears as “CTI Data Vetting [Test].” This tutorial is split into three parts so you can read only what applies to you:</w:t>
       </w:r>
     </w:p>
     <w:tbl>
@@ -284,21 +310,7 @@
                 <w:sz w:val="20"/>
                 <w:szCs w:val="20"/>
               </w:rPr>
-              <w:t>Normal users</w:t>
-            </w:r>
-            <w:r>
-              <w:rPr>
-                <w:sz w:val="20"/>
-                <w:szCs w:val="20"/>
-              </w:rPr>
-              <w:t xml:space="preserve"> </w:t>
-            </w:r>
-            <w:r>
-              <w:rPr>
-                <w:sz w:val="20"/>
-                <w:szCs w:val="20"/>
-              </w:rPr>
-              <w:t>who logs in to review or enter records</w:t>
+              <w:t>Normal users who logs in to review or enter records</w:t>
             </w:r>
           </w:p>
         </w:tc>
@@ -390,63 +402,7 @@
                 <w:sz w:val="20"/>
                 <w:szCs w:val="20"/>
               </w:rPr>
-              <w:t>Vetting</w:t>
-            </w:r>
-            <w:r>
-              <w:rPr>
-                <w:sz w:val="20"/>
-                <w:szCs w:val="20"/>
-              </w:rPr>
-              <w:t xml:space="preserve"> </w:t>
-            </w:r>
-            <w:r>
-              <w:rPr>
-                <w:sz w:val="20"/>
-                <w:szCs w:val="20"/>
-              </w:rPr>
-              <w:t>user</w:t>
-            </w:r>
-            <w:r>
-              <w:rPr>
-                <w:sz w:val="20"/>
-                <w:szCs w:val="20"/>
-              </w:rPr>
-              <w:t>s</w:t>
-            </w:r>
-            <w:r>
-              <w:rPr>
-                <w:sz w:val="20"/>
-                <w:szCs w:val="20"/>
-              </w:rPr>
-              <w:t xml:space="preserve"> assigned to approve </w:t>
-            </w:r>
-            <w:r>
-              <w:rPr>
-                <w:sz w:val="20"/>
-                <w:szCs w:val="20"/>
-              </w:rPr>
-              <w:t>normal user</w:t>
-            </w:r>
-            <w:r>
-              <w:rPr>
-                <w:sz w:val="20"/>
-                <w:szCs w:val="20"/>
-              </w:rPr>
-              <w:t xml:space="preserve"> </w:t>
-            </w:r>
-            <w:r>
-              <w:rPr>
-                <w:sz w:val="20"/>
-                <w:szCs w:val="20"/>
-              </w:rPr>
-              <w:t>record</w:t>
-            </w:r>
-            <w:r>
-              <w:rPr>
-                <w:sz w:val="20"/>
-                <w:szCs w:val="20"/>
-              </w:rPr>
-              <w:t xml:space="preserve"> entries</w:t>
+              <w:t>Vetting users assigned to approve normal user record entries</w:t>
             </w:r>
           </w:p>
         </w:tc>
@@ -538,21 +494,7 @@
                 <w:sz w:val="20"/>
                 <w:szCs w:val="20"/>
               </w:rPr>
-              <w:t>The server adminstrator who</w:t>
-            </w:r>
-            <w:r>
-              <w:rPr>
-                <w:sz w:val="20"/>
-                <w:szCs w:val="20"/>
-              </w:rPr>
-              <w:t xml:space="preserve"> </w:t>
-            </w:r>
-            <w:r>
-              <w:rPr>
-                <w:sz w:val="20"/>
-                <w:szCs w:val="20"/>
-              </w:rPr>
-              <w:t>sets up and manages the instance</w:t>
+              <w:t>The server adminstrator who sets up and manages the instance</w:t>
             </w:r>
           </w:p>
         </w:tc>
@@ -698,10 +640,37 @@
                 <w:sz w:val="20"/>
                 <w:szCs w:val="20"/>
               </w:rPr>
-              <w:t>Record Vetter</w:t>
-            </w:r>
-            <w:r>
-              <w:t xml:space="preserve"> on one or more records. So Part 2 </w:t>
+              <w:t>Group</w:t>
+            </w:r>
+            <w:r>
+              <w:rPr>
+                <w:rFonts w:ascii="Consolas" w:eastAsia="Consolas" w:hAnsi="Consolas" w:cs="Consolas"/>
+                <w:color w:val="2E75B6"/>
+                <w:sz w:val="20"/>
+                <w:szCs w:val="20"/>
+              </w:rPr>
+              <w:t xml:space="preserve"> Vetter</w:t>
+            </w:r>
+            <w:r>
+              <w:t xml:space="preserve"> on records</w:t>
+            </w:r>
+            <w:r>
+              <w:t xml:space="preserve"> </w:t>
+            </w:r>
+            <w:r>
+              <w:t xml:space="preserve">belongingin to the </w:t>
+            </w:r>
+            <w:r>
+              <w:rPr>
+                <w:rFonts w:ascii="Consolas" w:eastAsia="Consolas" w:hAnsi="Consolas" w:cs="Consolas"/>
+                <w:color w:val="2E75B6"/>
+                <w:sz w:val="20"/>
+                <w:szCs w:val="20"/>
+              </w:rPr>
+              <w:t>Group</w:t>
+            </w:r>
+            <w:r>
+              <w:t xml:space="preserve">. So Part 2 </w:t>
             </w:r>
             <w:r>
               <w:t xml:space="preserve">of this document </w:t>
@@ -847,10 +816,7 @@
         <w:t xml:space="preserve">This part covers everything a </w:t>
       </w:r>
       <w:r>
-        <w:t>normal</w:t>
-      </w:r>
-      <w:r>
-        <w:t xml:space="preserve"> </w:t>
+        <w:t xml:space="preserve">normal </w:t>
       </w:r>
       <w:r>
         <w:t>user needs: signing in, opening your data, editing records in the grid, fixing validation errors, and submitting your work.</w:t>
@@ -1518,13 +1484,7 @@
         <w:t xml:space="preserve">your records as rows and fields as columns. Each column header has a filter icon; each row has a </w:t>
       </w:r>
       <w:r>
-        <w:t>“duplicate”</w:t>
-      </w:r>
-      <w:r>
-        <w:t xml:space="preserve"> </w:t>
-      </w:r>
-      <w:r>
-        <w:t>button</w:t>
+        <w:t>“duplicate” button</w:t>
       </w:r>
       <w:r>
         <w:t xml:space="preserve"> on the left and a delete (trash) icon on the right.</w:t>
@@ -2120,13 +2080,7 @@
         <w:t>click a cell to see that field’s description and a sample value</w:t>
       </w:r>
       <w:r>
-        <w:t>.</w:t>
-      </w:r>
-      <w:r>
-        <w:t xml:space="preserve"> </w:t>
-      </w:r>
-      <w:r>
-        <w:t>This provides timely information to help the user fill in the requested information correctly.</w:t>
+        <w:t>. This provides timely information to help the user fill in the requested information correctly.</w:t>
       </w:r>
     </w:p>
     <w:p>
@@ -2263,13 +2217,7 @@
         <w:t xml:space="preserve"> </w:t>
       </w:r>
       <w:r>
-        <w:t>URLs become clickable links automatically</w:t>
-      </w:r>
-      <w:r>
-        <w:t>; this feature is intended to provide links to evidence but may have other uses</w:t>
-      </w:r>
-      <w:r>
-        <w:t>.</w:t>
+        <w:t>URLs become clickable links automatically; this feature is intended to provide links to evidence but may have other uses.</w:t>
       </w:r>
     </w:p>
     <w:p>
@@ -2503,10 +2451,7 @@
         <w:t xml:space="preserve"> </w:t>
       </w:r>
       <w:r>
-        <w:t>button</w:t>
-      </w:r>
-      <w:r>
-        <w:t xml:space="preserve"> </w:t>
+        <w:t xml:space="preserve">button </w:t>
       </w:r>
       <w:r>
         <w:t>on a row to copy it into a new record. Handy for similar entries; the copy is always unvetted.</w:t>
@@ -2589,10 +2534,7 @@
               <w:t xml:space="preserve"> to copy a value from one cell into another — </w:t>
             </w:r>
             <w:r>
-              <w:t>handy</w:t>
-            </w:r>
-            <w:r>
-              <w:t xml:space="preserve"> </w:t>
+              <w:t xml:space="preserve">handy </w:t>
             </w:r>
             <w:r>
               <w:t>when many cells share a value.</w:t>
@@ -2607,7 +2549,46 @@
         <w:jc w:val="both"/>
       </w:pPr>
       <w:r>
-        <w:t>1.5  Validation &amp; Fixing Errors</w:t>
+        <w:t>1</w:t>
+      </w:r>
+      <w:r>
+        <w:t>.</w:t>
+      </w:r>
+      <w:r>
+        <w:t>5</w:t>
+      </w:r>
+      <w:r>
+        <w:t xml:space="preserve">  Deleting Records</w:t>
+      </w:r>
+    </w:p>
+    <w:p>
+      <w:pPr>
+        <w:spacing w:after="120" w:line="276" w:lineRule="auto"/>
+        <w:jc w:val="both"/>
+      </w:pPr>
+      <w:r>
+        <w:t xml:space="preserve">Click the delete (trash) icon </w:t>
+      </w:r>
+      <w:r>
+        <w:t>to</w:t>
+      </w:r>
+      <w:r>
+        <w:t xml:space="preserve"> the right of the row; a confirmation prompt appears, and the deletion is recorded in the edit history.</w:t>
+      </w:r>
+    </w:p>
+    <w:p>
+      <w:pPr>
+        <w:pStyle w:val="Heading2"/>
+        <w:jc w:val="both"/>
+      </w:pPr>
+      <w:r>
+        <w:t>1.</w:t>
+      </w:r>
+      <w:r>
+        <w:t>6</w:t>
+      </w:r>
+      <w:r>
+        <w:t xml:space="preserve">  Validation &amp; Fixing Errors</w:t>
       </w:r>
     </w:p>
     <w:p>
@@ -2655,6 +2636,7 @@
         <w:jc w:val="both"/>
       </w:pPr>
       <w:r>
+        <w:lastRenderedPageBreak/>
         <w:t>Hover over it to read the error (e.g. “must be between 0 and 100”, “required”, or “is not a valid date. Use DD/MM/YYYY format”).</w:t>
       </w:r>
     </w:p>
@@ -2721,7 +2703,6 @@
               <w:rPr>
                 <w:noProof/>
               </w:rPr>
-              <w:lastRenderedPageBreak/>
               <w:drawing>
                 <wp:inline distT="0" distB="0" distL="0" distR="0" wp14:anchorId="63ACBBD0" wp14:editId="74ADFF30">
                   <wp:extent cx="5715000" cy="2409825"/>
@@ -2917,6 +2898,7 @@
               <w:rPr>
                 <w:noProof/>
               </w:rPr>
+              <w:lastRenderedPageBreak/>
               <w:drawing>
                 <wp:inline distT="0" distB="0" distL="0" distR="0" wp14:anchorId="5223D277" wp14:editId="5C720FD2">
                   <wp:extent cx="5713992" cy="2235200"/>
@@ -3104,7 +3086,13 @@
         <w:jc w:val="both"/>
       </w:pPr>
       <w:r>
-        <w:t>1.6  Record Locking</w:t>
+        <w:t>1.</w:t>
+      </w:r>
+      <w:r>
+        <w:t>7</w:t>
+      </w:r>
+      <w:r>
+        <w:t xml:space="preserve">  Record Locking</w:t>
       </w:r>
     </w:p>
     <w:p>
@@ -3245,7 +3233,13 @@
         <w:jc w:val="both"/>
       </w:pPr>
       <w:r>
-        <w:t>1.7  Protected Fields</w:t>
+        <w:t>1.</w:t>
+      </w:r>
+      <w:r>
+        <w:t>8</w:t>
+      </w:r>
+      <w:r>
+        <w:t xml:space="preserve">  Protected Fields</w:t>
       </w:r>
     </w:p>
     <w:p>
@@ -3254,6 +3248,7 @@
         <w:jc w:val="both"/>
       </w:pPr>
       <w:r>
+        <w:lastRenderedPageBreak/>
         <w:t>Some fields are marked protected by the administrator — stable, sensitive values such as identifiers or baseline figures. On existing records</w:t>
       </w:r>
       <w:r>
@@ -3263,13 +3258,7 @@
         <w:t xml:space="preserve"> they appear with an amber, </w:t>
       </w:r>
       <w:r>
-        <w:t>italici</w:t>
-      </w:r>
-      <w:r>
-        <w:t>z</w:t>
-      </w:r>
-      <w:r>
-        <w:t xml:space="preserve">ed </w:t>
+        <w:t xml:space="preserve">italicized </w:t>
       </w:r>
       <w:r>
         <w:t>background and are read-only for owners. You can still set them when you first create a record; after you submit</w:t>
@@ -3290,7 +3279,13 @@
         <w:jc w:val="both"/>
       </w:pPr>
       <w:r>
-        <w:t>1.8  Submitting Your Changes</w:t>
+        <w:t>1.</w:t>
+      </w:r>
+      <w:r>
+        <w:t>9</w:t>
+      </w:r>
+      <w:r>
+        <w:t xml:space="preserve">  Submitting Your Changes</w:t>
       </w:r>
     </w:p>
     <w:p>
@@ -3437,7 +3432,6 @@
                 <w:sz w:val="18"/>
                 <w:szCs w:val="18"/>
               </w:rPr>
-              <w:lastRenderedPageBreak/>
               <w:t xml:space="preserve">WARNING  </w:t>
             </w:r>
             <w:r>
@@ -3473,7 +3467,13 @@
         <w:jc w:val="both"/>
       </w:pPr>
       <w:r>
-        <w:t>1.9  Session &amp; Auto-Logout</w:t>
+        <w:t>1.</w:t>
+      </w:r>
+      <w:r>
+        <w:t>10</w:t>
+      </w:r>
+      <w:r>
+        <w:t xml:space="preserve">  Session &amp; Auto-Logout</w:t>
       </w:r>
     </w:p>
     <w:p>
@@ -3515,7 +3515,13 @@
         <w:jc w:val="both"/>
       </w:pPr>
       <w:r>
-        <w:t>A vetter is a user assigned to approve specific records. Everything in Part 1 still applies; this part adds the extra abilities you get as a vetter.</w:t>
+        <w:t xml:space="preserve">A vetter is a user assigned to approve specific </w:t>
+      </w:r>
+      <w:r>
+        <w:t xml:space="preserve">Group </w:t>
+      </w:r>
+      <w:r>
+        <w:t>records. Everything in Part 1 still applies; this part adds the extra abilities you get as a vetter.</w:t>
       </w:r>
     </w:p>
     <w:p>
@@ -3533,19 +3539,52 @@
         <w:jc w:val="both"/>
       </w:pPr>
       <w:r>
-        <w:t>You are a vetter for any record where your User ID appears in the Vetter column. On those records</w:t>
+        <w:t xml:space="preserve">You are a vetter for </w:t>
+      </w:r>
+      <w:r>
+        <w:t>a</w:t>
+      </w:r>
+      <w:r>
+        <w:t xml:space="preserve"> record </w:t>
+      </w:r>
+      <w:r>
+        <w:t xml:space="preserve">if </w:t>
+      </w:r>
+      <w:r>
+        <w:t xml:space="preserve">your User </w:t>
+      </w:r>
+      <w:r>
+        <w:t>Group matches the record’s Group</w:t>
+      </w:r>
+      <w:r>
+        <w:t>. On those records</w:t>
       </w:r>
       <w:r>
         <w:t>,</w:t>
       </w:r>
       <w:r>
-        <w:t xml:space="preserve"> you will see an editable Vetted checkbox</w:t>
+        <w:t xml:space="preserve"> you can edit </w:t>
+      </w:r>
+      <w:r>
+        <w:t>any</w:t>
+      </w:r>
+      <w:r>
+        <w:t xml:space="preserve"> field</w:t>
       </w:r>
       <w:r>
         <w:t>,</w:t>
       </w:r>
       <w:r>
-        <w:t xml:space="preserve"> and you can edit every field — including ones the owner cannot.</w:t>
+        <w:t xml:space="preserve"> including ones the owner cannot</w:t>
+      </w:r>
+      <w:r>
+        <w:t>, and once done, mark the</w:t>
+      </w:r>
+      <w:r>
+        <w:t xml:space="preserve"> editable Vetted checkbox</w:t>
+      </w:r>
+      <w:r>
+        <w:t>.</w:t>
       </w:r>
     </w:p>
     <w:tbl>
@@ -3729,7 +3768,14 @@
                 <w:sz w:val="20"/>
                 <w:szCs w:val="20"/>
               </w:rPr>
-              <w:t>Record Vetter</w:t>
+              <w:t>Group</w:t>
+            </w:r>
+            <w:r>
+              <w:rPr>
+                <w:sz w:val="20"/>
+                <w:szCs w:val="20"/>
+              </w:rPr>
+              <w:t xml:space="preserve"> Vetter</w:t>
             </w:r>
           </w:p>
         </w:tc>
@@ -3759,7 +3805,14 @@
                 <w:sz w:val="20"/>
                 <w:szCs w:val="20"/>
               </w:rPr>
-              <w:t>Edit all fields; check/uncheck Vetted; delete records assigned to them</w:t>
+              <w:t xml:space="preserve">Edit all fields; check/uncheck Vetted; delete records </w:t>
+            </w:r>
+            <w:r>
+              <w:rPr>
+                <w:sz w:val="20"/>
+                <w:szCs w:val="20"/>
+              </w:rPr>
+              <w:t>belonging to the same group as the vetter</w:t>
             </w:r>
           </w:p>
         </w:tc>
@@ -4157,7 +4210,13 @@
         <w:t>,</w:t>
       </w:r>
       <w:r>
-        <w:t xml:space="preserve"> you can edit all fields at any time and change Record Status on a vetted record (the owner can only change status while the record is not vetted). Status values are New, Updated, Old, and Delete, and every change is logged in the Edit History panel.</w:t>
+        <w:t xml:space="preserve"> you can edit all fields at any time and change Record Status on a vetted record (the owner can only change status while the record is not vetted). Status values are New, Updated, Old, and </w:t>
+      </w:r>
+      <w:r>
+        <w:t>Archived</w:t>
+      </w:r>
+      <w:r>
+        <w:t>, and every change is logged in the Edit History panel.</w:t>
       </w:r>
     </w:p>
     <w:p>
@@ -4175,7 +4234,13 @@
         <w:jc w:val="both"/>
       </w:pPr>
       <w:r>
-        <w:t>Only the assigned vetter can delete a record. Click the delete (trash) icon at the right of the row; a confirmation prompt appears, and the deletion is recorded in the edit history. (Owners cannot delete their own records — this protects data integrity.)</w:t>
+        <w:t xml:space="preserve">Click the delete (trash) icon </w:t>
+      </w:r>
+      <w:r>
+        <w:t>to</w:t>
+      </w:r>
+      <w:r>
+        <w:t xml:space="preserve"> the right of the row; a confirmation prompt appears, and the deletion is recorded in the edit history.</w:t>
       </w:r>
     </w:p>
     <w:tbl>
@@ -4363,7 +4428,27 @@
           <w:sz w:val="18"/>
           <w:szCs w:val="18"/>
         </w:rPr>
-        <w:t>Figure 9. As the assigned vetter, use the trash icon at the right of a row to delete a record; a confirmation appears and the deletion is recorded in the edit history.</w:t>
+        <w:t>Figure 9. As the assigned vetter, use the trash icon at the right of a row to delete a record; a confirmation appears</w:t>
+      </w:r>
+      <w:r>
+        <w:rPr>
+          <w:i/>
+          <w:iCs/>
+          <w:color w:val="666666"/>
+          <w:sz w:val="18"/>
+          <w:szCs w:val="18"/>
+        </w:rPr>
+        <w:t>,</w:t>
+      </w:r>
+      <w:r>
+        <w:rPr>
+          <w:i/>
+          <w:iCs/>
+          <w:color w:val="666666"/>
+          <w:sz w:val="18"/>
+          <w:szCs w:val="18"/>
+        </w:rPr>
+        <w:t xml:space="preserve"> and the deletion is recorded in the edit history.</w:t>
       </w:r>
     </w:p>
     <w:p>
@@ -5263,6 +5348,229 @@
           </w:p>
         </w:tc>
       </w:tr>
+      <w:tr>
+        <w:tc>
+          <w:tcPr>
+            <w:tcW w:w="2700" w:type="dxa"/>
+            <w:tcBorders>
+              <w:top w:val="single" w:sz="1" w:space="0" w:color="CCCCCC"/>
+              <w:left w:val="single" w:sz="1" w:space="0" w:color="CCCCCC"/>
+              <w:bottom w:val="single" w:sz="1" w:space="0" w:color="CCCCCC"/>
+              <w:right w:val="single" w:sz="1" w:space="0" w:color="CCCCCC"/>
+            </w:tcBorders>
+            <w:shd w:val="clear" w:color="auto" w:fill="FFFFFF"/>
+            <w:tcMar>
+              <w:top w:w="70" w:type="dxa"/>
+              <w:left w:w="120" w:type="dxa"/>
+              <w:bottom w:w="70" w:type="dxa"/>
+              <w:right w:w="120" w:type="dxa"/>
+            </w:tcMar>
+          </w:tcPr>
+          <w:p>
+            <w:pPr>
+              <w:jc w:val="both"/>
+              <w:rPr>
+                <w:rFonts w:ascii="Consolas" w:eastAsia="Consolas" w:hAnsi="Consolas" w:cs="Consolas"/>
+                <w:color w:val="2E75B6"/>
+                <w:sz w:val="19"/>
+                <w:szCs w:val="19"/>
+              </w:rPr>
+            </w:pPr>
+            <w:r>
+              <w:rPr>
+                <w:rFonts w:ascii="Consolas" w:eastAsia="Consolas" w:hAnsi="Consolas" w:cs="Consolas"/>
+                <w:color w:val="2E75B6"/>
+                <w:sz w:val="19"/>
+                <w:szCs w:val="19"/>
+              </w:rPr>
+              <w:t>admin_allowed_ips</w:t>
+            </w:r>
+          </w:p>
+        </w:tc>
+        <w:tc>
+          <w:tcPr>
+            <w:tcW w:w="5260" w:type="dxa"/>
+            <w:tcBorders>
+              <w:top w:val="single" w:sz="1" w:space="0" w:color="CCCCCC"/>
+              <w:left w:val="single" w:sz="1" w:space="0" w:color="CCCCCC"/>
+              <w:bottom w:val="single" w:sz="1" w:space="0" w:color="CCCCCC"/>
+              <w:right w:val="single" w:sz="1" w:space="0" w:color="CCCCCC"/>
+            </w:tcBorders>
+            <w:shd w:val="clear" w:color="auto" w:fill="FFFFFF"/>
+            <w:tcMar>
+              <w:top w:w="70" w:type="dxa"/>
+              <w:left w:w="120" w:type="dxa"/>
+              <w:bottom w:w="70" w:type="dxa"/>
+              <w:right w:w="120" w:type="dxa"/>
+            </w:tcMar>
+          </w:tcPr>
+          <w:p>
+            <w:pPr>
+              <w:jc w:val="both"/>
+              <w:rPr>
+                <w:sz w:val="20"/>
+                <w:szCs w:val="20"/>
+              </w:rPr>
+            </w:pPr>
+            <w:r>
+              <w:rPr>
+                <w:sz w:val="20"/>
+                <w:szCs w:val="20"/>
+              </w:rPr>
+              <w:t>List of approved IP addresses or IP scopes</w:t>
+            </w:r>
+            <w:r>
+              <w:rPr>
+                <w:sz w:val="20"/>
+                <w:szCs w:val="20"/>
+              </w:rPr>
+              <w:t xml:space="preserve"> for Admin login</w:t>
+            </w:r>
+          </w:p>
+        </w:tc>
+        <w:tc>
+          <w:tcPr>
+            <w:tcW w:w="1400" w:type="dxa"/>
+            <w:tcBorders>
+              <w:top w:val="single" w:sz="1" w:space="0" w:color="CCCCCC"/>
+              <w:left w:val="single" w:sz="1" w:space="0" w:color="CCCCCC"/>
+              <w:bottom w:val="single" w:sz="1" w:space="0" w:color="CCCCCC"/>
+              <w:right w:val="single" w:sz="1" w:space="0" w:color="CCCCCC"/>
+            </w:tcBorders>
+            <w:shd w:val="clear" w:color="auto" w:fill="FFFFFF"/>
+            <w:tcMar>
+              <w:top w:w="70" w:type="dxa"/>
+              <w:left w:w="120" w:type="dxa"/>
+              <w:bottom w:w="70" w:type="dxa"/>
+              <w:right w:w="120" w:type="dxa"/>
+            </w:tcMar>
+          </w:tcPr>
+          <w:p>
+            <w:pPr>
+              <w:jc w:val="both"/>
+              <w:rPr>
+                <w:sz w:val="20"/>
+                <w:szCs w:val="20"/>
+              </w:rPr>
+            </w:pPr>
+            <w:r>
+              <w:rPr>
+                <w:sz w:val="20"/>
+                <w:szCs w:val="20"/>
+              </w:rPr>
+              <w:t>Yes</w:t>
+            </w:r>
+          </w:p>
+        </w:tc>
+      </w:tr>
+      <w:tr>
+        <w:tc>
+          <w:tcPr>
+            <w:tcW w:w="2700" w:type="dxa"/>
+            <w:tcBorders>
+              <w:top w:val="single" w:sz="1" w:space="0" w:color="CCCCCC"/>
+              <w:left w:val="single" w:sz="1" w:space="0" w:color="CCCCCC"/>
+              <w:bottom w:val="single" w:sz="1" w:space="0" w:color="CCCCCC"/>
+              <w:right w:val="single" w:sz="1" w:space="0" w:color="CCCCCC"/>
+            </w:tcBorders>
+            <w:shd w:val="clear" w:color="auto" w:fill="FFFFFF"/>
+            <w:tcMar>
+              <w:top w:w="70" w:type="dxa"/>
+              <w:left w:w="120" w:type="dxa"/>
+              <w:bottom w:w="70" w:type="dxa"/>
+              <w:right w:w="120" w:type="dxa"/>
+            </w:tcMar>
+          </w:tcPr>
+          <w:p>
+            <w:pPr>
+              <w:jc w:val="both"/>
+              <w:rPr>
+                <w:rFonts w:ascii="Consolas" w:eastAsia="Consolas" w:hAnsi="Consolas" w:cs="Consolas"/>
+                <w:color w:val="2E75B6"/>
+                <w:sz w:val="19"/>
+                <w:szCs w:val="19"/>
+              </w:rPr>
+            </w:pPr>
+            <w:r>
+              <w:rPr>
+                <w:rFonts w:ascii="Consolas" w:eastAsia="Consolas" w:hAnsi="Consolas" w:cs="Consolas"/>
+                <w:color w:val="2E75B6"/>
+                <w:sz w:val="19"/>
+                <w:szCs w:val="19"/>
+              </w:rPr>
+              <w:t>pin_expiration_minutes</w:t>
+            </w:r>
+          </w:p>
+        </w:tc>
+        <w:tc>
+          <w:tcPr>
+            <w:tcW w:w="5260" w:type="dxa"/>
+            <w:tcBorders>
+              <w:top w:val="single" w:sz="1" w:space="0" w:color="CCCCCC"/>
+              <w:left w:val="single" w:sz="1" w:space="0" w:color="CCCCCC"/>
+              <w:bottom w:val="single" w:sz="1" w:space="0" w:color="CCCCCC"/>
+              <w:right w:val="single" w:sz="1" w:space="0" w:color="CCCCCC"/>
+            </w:tcBorders>
+            <w:shd w:val="clear" w:color="auto" w:fill="FFFFFF"/>
+            <w:tcMar>
+              <w:top w:w="70" w:type="dxa"/>
+              <w:left w:w="120" w:type="dxa"/>
+              <w:bottom w:w="70" w:type="dxa"/>
+              <w:right w:w="120" w:type="dxa"/>
+            </w:tcMar>
+          </w:tcPr>
+          <w:p>
+            <w:pPr>
+              <w:jc w:val="both"/>
+              <w:rPr>
+                <w:sz w:val="20"/>
+                <w:szCs w:val="20"/>
+              </w:rPr>
+            </w:pPr>
+            <w:r>
+              <w:rPr>
+                <w:sz w:val="20"/>
+                <w:szCs w:val="20"/>
+              </w:rPr>
+              <w:t>Expiriation time for the emailed login PIN</w:t>
+            </w:r>
+          </w:p>
+        </w:tc>
+        <w:tc>
+          <w:tcPr>
+            <w:tcW w:w="1400" w:type="dxa"/>
+            <w:tcBorders>
+              <w:top w:val="single" w:sz="1" w:space="0" w:color="CCCCCC"/>
+              <w:left w:val="single" w:sz="1" w:space="0" w:color="CCCCCC"/>
+              <w:bottom w:val="single" w:sz="1" w:space="0" w:color="CCCCCC"/>
+              <w:right w:val="single" w:sz="1" w:space="0" w:color="CCCCCC"/>
+            </w:tcBorders>
+            <w:shd w:val="clear" w:color="auto" w:fill="FFFFFF"/>
+            <w:tcMar>
+              <w:top w:w="70" w:type="dxa"/>
+              <w:left w:w="120" w:type="dxa"/>
+              <w:bottom w:w="70" w:type="dxa"/>
+              <w:right w:w="120" w:type="dxa"/>
+            </w:tcMar>
+          </w:tcPr>
+          <w:p>
+            <w:pPr>
+              <w:jc w:val="both"/>
+              <w:rPr>
+                <w:sz w:val="20"/>
+                <w:szCs w:val="20"/>
+              </w:rPr>
+            </w:pPr>
+            <w:r>
+              <w:rPr>
+                <w:sz w:val="20"/>
+                <w:szCs w:val="20"/>
+              </w:rPr>
+              <w:t>No</w:t>
+            </w:r>
+          </w:p>
+        </w:tc>
+      </w:tr>
     </w:tbl>
     <w:p>
       <w:pPr>
@@ -5630,13 +5938,7 @@
         <w:t xml:space="preserve">ConduVet validates that the Data and Schema sheets exist and that every Schema field </w:t>
       </w:r>
       <w:r>
-        <w:t>ma</w:t>
-      </w:r>
-      <w:r>
-        <w:t>ps to</w:t>
-      </w:r>
-      <w:r>
-        <w:t xml:space="preserve"> </w:t>
+        <w:t xml:space="preserve">maps to </w:t>
       </w:r>
       <w:r>
         <w:t xml:space="preserve">a Data column; field-level errors are shown </w:t>

</xml_diff>

<commit_message>
update manual for record duplicaiton
</commit_message>
<xml_diff>
--- a/ConduVet_User_Tutorial.docx
+++ b/ConduVet_User_Tutorial.docx
@@ -37,7 +37,23 @@
           <w:sz w:val="40"/>
           <w:szCs w:val="40"/>
         </w:rPr>
-        <w:t xml:space="preserve"> (V0.2)</w:t>
+        <w:t xml:space="preserve"> (V0.</w:t>
+      </w:r>
+      <w:r>
+        <w:rPr>
+          <w:color w:val="2E75B6"/>
+          <w:sz w:val="40"/>
+          <w:szCs w:val="40"/>
+        </w:rPr>
+        <w:t>3</w:t>
+      </w:r>
+      <w:r>
+        <w:rPr>
+          <w:color w:val="2E75B6"/>
+          <w:sz w:val="40"/>
+          <w:szCs w:val="40"/>
+        </w:rPr>
+        <w:t>)</w:t>
       </w:r>
     </w:p>
     <w:p>
@@ -2360,6 +2376,121 @@
         <w:jc w:val="both"/>
       </w:pPr>
       <w:r>
+        <w:t>Copying</w:t>
+      </w:r>
+      <w:r>
+        <w:t>/Duplicating</w:t>
+      </w:r>
+      <w:r>
+        <w:t xml:space="preserve"> a record</w:t>
+      </w:r>
+    </w:p>
+    <w:p>
+      <w:pPr>
+        <w:pStyle w:val="ListParagraph"/>
+        <w:numPr>
+          <w:ilvl w:val="0"/>
+          <w:numId w:val="2"/>
+        </w:numPr>
+        <w:spacing w:after="60" w:line="276" w:lineRule="auto"/>
+        <w:jc w:val="both"/>
+      </w:pPr>
+      <w:r>
+        <w:t xml:space="preserve">You may use the copy/duplicate record </w:t>
+      </w:r>
+      <w:r>
+        <w:t xml:space="preserve">button </w:t>
+      </w:r>
+      <w:r>
+        <w:rPr>
+          <w:noProof/>
+        </w:rPr>
+        <w:drawing>
+          <wp:inline distT="0" distB="0" distL="0" distR="0" wp14:anchorId="409547BF" wp14:editId="55B9106D">
+            <wp:extent cx="185853" cy="201316"/>
+            <wp:effectExtent l="0" t="0" r="5080" b="1905"/>
+            <wp:docPr id="1606147176" name="u4.png" descr="Figure 4. Click a cell to select it (highlighted blue); the context panel shows the field’s help and its allowed values." title="Figure 4. Click a cell to select it (highlighted blue); the context panel shows the field’s help and its allowed values."/>
+            <wp:cNvGraphicFramePr>
+              <a:graphicFrameLocks xmlns:a="http://schemas.openxmlformats.org/drawingml/2006/main" noChangeAspect="1"/>
+            </wp:cNvGraphicFramePr>
+            <a:graphic xmlns:a="http://schemas.openxmlformats.org/drawingml/2006/main">
+              <a:graphicData uri="http://schemas.openxmlformats.org/drawingml/2006/picture">
+                <pic:pic xmlns:pic="http://schemas.openxmlformats.org/drawingml/2006/picture">
+                  <pic:nvPicPr>
+                    <pic:cNvPr id="0" name=""/>
+                    <pic:cNvPicPr>
+                      <a:picLocks noChangeAspect="1" noChangeArrowheads="1"/>
+                    </pic:cNvPicPr>
+                  </pic:nvPicPr>
+                  <pic:blipFill rotWithShape="1">
+                    <a:blip r:embed="rId10"/>
+                    <a:srcRect l="572" t="21973" r="98317" b="75429"/>
+                    <a:stretch>
+                      <a:fillRect/>
+                    </a:stretch>
+                  </pic:blipFill>
+                  <pic:spPr bwMode="auto">
+                    <a:xfrm>
+                      <a:off x="0" y="0"/>
+                      <a:ext cx="216345" cy="234345"/>
+                    </a:xfrm>
+                    <a:prstGeom prst="rect">
+                      <a:avLst/>
+                    </a:prstGeom>
+                    <a:ln>
+                      <a:noFill/>
+                    </a:ln>
+                    <a:extLst>
+                      <a:ext uri="{53640926-AAD7-44D8-BBD7-CCE9431645EC}">
+                        <a14:shadowObscured xmlns:a14="http://schemas.microsoft.com/office/drawing/2010/main"/>
+                      </a:ext>
+                    </a:extLst>
+                  </pic:spPr>
+                </pic:pic>
+              </a:graphicData>
+            </a:graphic>
+          </wp:inline>
+        </w:drawing>
+      </w:r>
+      <w:r>
+        <w:t xml:space="preserve"> to </w:t>
+      </w:r>
+      <w:r>
+        <w:t>use</w:t>
+      </w:r>
+      <w:r>
+        <w:t xml:space="preserve"> existing record data in creating a new record.</w:t>
+      </w:r>
+    </w:p>
+    <w:p>
+      <w:pPr>
+        <w:pStyle w:val="ListParagraph"/>
+        <w:numPr>
+          <w:ilvl w:val="0"/>
+          <w:numId w:val="2"/>
+        </w:numPr>
+        <w:spacing w:after="60" w:line="276" w:lineRule="auto"/>
+        <w:jc w:val="both"/>
+      </w:pPr>
+      <w:r>
+        <w:t xml:space="preserve">This is especially handy when </w:t>
+      </w:r>
+      <w:r>
+        <w:t>the needed record is p</w:t>
+      </w:r>
+      <w:r>
+        <w:t xml:space="preserve">rotected </w:t>
+      </w:r>
+      <w:r>
+        <w:t>and cannot be edited. Using this feature you can duplicate the record, edit your new record data, seperately from the locked record.</w:t>
+      </w:r>
+    </w:p>
+    <w:p>
+      <w:pPr>
+        <w:pStyle w:val="Heading3"/>
+        <w:jc w:val="both"/>
+      </w:pPr>
+      <w:r>
         <w:t>Adding a record</w:t>
       </w:r>
     </w:p>
@@ -2427,35 +2558,9 @@
     </w:p>
     <w:p>
       <w:pPr>
-        <w:pStyle w:val="ListParagraph"/>
-        <w:numPr>
-          <w:ilvl w:val="0"/>
-          <w:numId w:val="2"/>
-        </w:numPr>
         <w:spacing w:after="60" w:line="276" w:lineRule="auto"/>
         <w:jc w:val="both"/>
       </w:pPr>
-      <w:r>
-        <w:t xml:space="preserve">Or use the </w:t>
-      </w:r>
-      <w:r>
-        <w:t>“</w:t>
-      </w:r>
-      <w:r>
-        <w:t>duplicate</w:t>
-      </w:r>
-      <w:r>
-        <w:t>”</w:t>
-      </w:r>
-      <w:r>
-        <w:t xml:space="preserve"> </w:t>
-      </w:r>
-      <w:r>
-        <w:t xml:space="preserve">button </w:t>
-      </w:r>
-      <w:r>
-        <w:t>on a row to copy it into a new record. Handy for similar entries; the copy is always unvetted.</w:t>
-      </w:r>
     </w:p>
     <w:tbl>
       <w:tblPr>
@@ -2508,7 +2613,17 @@
                 <w:sz w:val="18"/>
                 <w:szCs w:val="18"/>
               </w:rPr>
-              <w:t xml:space="preserve">TIP  </w:t>
+              <w:t>T</w:t>
+            </w:r>
+            <w:r>
+              <w:rPr>
+                <w:b/>
+                <w:bCs/>
+                <w:color w:val="2E75B6"/>
+                <w:sz w:val="18"/>
+                <w:szCs w:val="18"/>
+              </w:rPr>
+              <w:t xml:space="preserve">IP  </w:t>
             </w:r>
             <w:r>
               <w:t xml:space="preserve">Use </w:t>
@@ -2549,16 +2664,7 @@
         <w:jc w:val="both"/>
       </w:pPr>
       <w:r>
-        <w:t>1</w:t>
-      </w:r>
-      <w:r>
-        <w:t>.</w:t>
-      </w:r>
-      <w:r>
-        <w:t>5</w:t>
-      </w:r>
-      <w:r>
-        <w:t xml:space="preserve">  Deleting Records</w:t>
+        <w:t>1.5  Deleting Records</w:t>
       </w:r>
     </w:p>
     <w:p>
@@ -2567,13 +2673,7 @@
         <w:jc w:val="both"/>
       </w:pPr>
       <w:r>
-        <w:t xml:space="preserve">Click the delete (trash) icon </w:t>
-      </w:r>
-      <w:r>
-        <w:t>to</w:t>
-      </w:r>
-      <w:r>
-        <w:t xml:space="preserve"> the right of the row; a confirmation prompt appears, and the deletion is recorded in the edit history.</w:t>
+        <w:t>Click the delete (trash) icon to the right of the row; a confirmation prompt appears, and the deletion is recorded in the edit history.</w:t>
       </w:r>
     </w:p>
     <w:p>
@@ -2597,6 +2697,7 @@
         <w:jc w:val="both"/>
       </w:pPr>
       <w:r>
+        <w:lastRenderedPageBreak/>
         <w:t>ConduVet checks your entries as you type and again when you submit — type, numeric range, text length, required fields (including conditional “depends-on” rules), and allowed dropdown values.</w:t>
       </w:r>
     </w:p>
@@ -2636,7 +2737,6 @@
         <w:jc w:val="both"/>
       </w:pPr>
       <w:r>
-        <w:lastRenderedPageBreak/>
         <w:t>Hover over it to read the error (e.g. “must be between 0 and 100”, “required”, or “is not a valid date. Use DD/MM/YYYY format”).</w:t>
       </w:r>
     </w:p>
@@ -3270,7 +3370,13 @@
         <w:t xml:space="preserve"> they lock. If a protected field needs to change later, ask your vetter or admin.</w:t>
       </w:r>
       <w:r>
-        <w:t xml:space="preserve"> You can always copy the record into a new one and make the edit you need, inform the vetter of what you’d like to do with the original record.</w:t>
+        <w:t xml:space="preserve"> You can always copy the record into a new one and make the edit you need, </w:t>
+      </w:r>
+      <w:r>
+        <w:t xml:space="preserve">and </w:t>
+      </w:r>
+      <w:r>
+        <w:t>inform the vetter of what you’d like to do with the original record.</w:t>
       </w:r>
     </w:p>
     <w:p>
@@ -3578,10 +3684,7 @@
         <w:t xml:space="preserve"> including ones the owner cannot</w:t>
       </w:r>
       <w:r>
-        <w:t>, and once done, mark the</w:t>
-      </w:r>
-      <w:r>
-        <w:t xml:space="preserve"> editable Vetted checkbox</w:t>
+        <w:t>, and once done, mark the editable Vetted checkbox</w:t>
       </w:r>
       <w:r>
         <w:t>.</w:t>
@@ -3768,14 +3871,7 @@
                 <w:sz w:val="20"/>
                 <w:szCs w:val="20"/>
               </w:rPr>
-              <w:t>Group</w:t>
-            </w:r>
-            <w:r>
-              <w:rPr>
-                <w:sz w:val="20"/>
-                <w:szCs w:val="20"/>
-              </w:rPr>
-              <w:t xml:space="preserve"> Vetter</w:t>
+              <w:t>Group Vetter</w:t>
             </w:r>
           </w:p>
         </w:tc>

</xml_diff>